<commit_message>
DB subway HW redo
</commit_message>
<xml_diff>
--- a/DB_Dias_Yermekov_HW_Subway_descriptions.docx
+++ b/DB_Dias_Yermekov_HW_Subway_descriptions.docx
@@ -1658,10 +1658,10 @@
           <w:noProof/>
         </w:rPr>
         <w:drawing>
-          <wp:inline distT="0" distB="0" distL="0" distR="0" wp14:anchorId="4B0AA253" wp14:editId="1C18309F">
-            <wp:extent cx="5929630" cy="3830955"/>
-            <wp:effectExtent l="0" t="0" r="0" b="0"/>
-            <wp:docPr id="1986659997" name="Рисунок 4"/>
+          <wp:inline distT="0" distB="0" distL="0" distR="0" wp14:anchorId="087DCD1F" wp14:editId="1142816B">
+            <wp:extent cx="5935345" cy="3827145"/>
+            <wp:effectExtent l="0" t="0" r="8255" b="1905"/>
+            <wp:docPr id="1753333653" name="Рисунок 4"/>
             <wp:cNvGraphicFramePr>
               <a:graphicFrameLocks xmlns:a="http://schemas.openxmlformats.org/drawingml/2006/main" noChangeAspect="1"/>
             </wp:cNvGraphicFramePr>
@@ -1690,7 +1690,7 @@
                   <pic:spPr bwMode="auto">
                     <a:xfrm>
                       <a:off x="0" y="0"/>
-                      <a:ext cx="5929630" cy="3830955"/>
+                      <a:ext cx="5935345" cy="3827145"/>
                     </a:xfrm>
                     <a:prstGeom prst="rect">
                       <a:avLst/>
@@ -7045,7 +7045,35 @@
           <w:b/>
           <w:bCs/>
         </w:rPr>
-        <w:t>(one-to-many)</w:t>
+        <w:t>(</w:t>
+      </w:r>
+      <w:r>
+        <w:rPr>
+          <w:b/>
+          <w:bCs/>
+        </w:rPr>
+        <w:t>many</w:t>
+      </w:r>
+      <w:r>
+        <w:rPr>
+          <w:b/>
+          <w:bCs/>
+        </w:rPr>
+        <w:t>-to-</w:t>
+      </w:r>
+      <w:r>
+        <w:rPr>
+          <w:b/>
+          <w:bCs/>
+        </w:rPr>
+        <w:t>one</w:t>
+      </w:r>
+      <w:r>
+        <w:rPr>
+          <w:b/>
+          <w:bCs/>
+        </w:rPr>
+        <w:t>)</w:t>
       </w:r>
       <w:r>
         <w:rPr>
@@ -15055,6 +15083,13 @@
           <w:bCs/>
         </w:rPr>
         <w:t>Object(many_to_one)</w:t>
+      </w:r>
+      <w:r>
+        <w:rPr>
+          <w:b/>
+          <w:bCs/>
+        </w:rPr>
+        <w:t>, Employeemaintenance(many-to-one)</w:t>
       </w:r>
     </w:p>
     <w:p>
@@ -21496,14 +21531,7 @@
                 <w:b/>
                 <w:bCs/>
               </w:rPr>
-              <w:t>2024-11-0</w:t>
-            </w:r>
-            <w:r>
-              <w:rPr>
-                <w:b/>
-                <w:bCs/>
-              </w:rPr>
-              <w:t>9</w:t>
+              <w:t>2024-11-09</w:t>
             </w:r>
           </w:p>
         </w:tc>
@@ -21620,14 +21648,7 @@
                 <w:b/>
                 <w:bCs/>
               </w:rPr>
-              <w:t>2024-11-0</w:t>
-            </w:r>
-            <w:r>
-              <w:rPr>
-                <w:b/>
-                <w:bCs/>
-              </w:rPr>
-              <w:t>9</w:t>
+              <w:t>2024-11-09</w:t>
             </w:r>
           </w:p>
         </w:tc>
@@ -21744,14 +21765,7 @@
                 <w:b/>
                 <w:bCs/>
               </w:rPr>
-              <w:t>2024-11-0</w:t>
-            </w:r>
-            <w:r>
-              <w:rPr>
-                <w:b/>
-                <w:bCs/>
-              </w:rPr>
-              <w:t>9</w:t>
+              <w:t>2024-11-09</w:t>
             </w:r>
           </w:p>
         </w:tc>
@@ -21847,21 +21861,7 @@
           <w:b/>
           <w:bCs/>
         </w:rPr>
-        <w:t xml:space="preserve">Bridge between many to many with </w:t>
-      </w:r>
-      <w:r>
-        <w:rPr>
-          <w:b/>
-          <w:bCs/>
-        </w:rPr>
-        <w:t>Stations</w:t>
-      </w:r>
-      <w:r>
-        <w:rPr>
-          <w:b/>
-          <w:bCs/>
-        </w:rPr>
-        <w:t xml:space="preserve"> and Employees</w:t>
+        <w:t>Bridge between many to many with Stations and Employees</w:t>
       </w:r>
     </w:p>
     <w:tbl>
@@ -23415,14 +23415,7 @@
                 <w:b/>
                 <w:bCs/>
               </w:rPr>
-              <w:t>2024-11-0</w:t>
-            </w:r>
-            <w:r>
-              <w:rPr>
-                <w:b/>
-                <w:bCs/>
-              </w:rPr>
-              <w:t>9</w:t>
+              <w:t>2024-11-09</w:t>
             </w:r>
           </w:p>
         </w:tc>
@@ -23539,14 +23532,7 @@
                 <w:b/>
                 <w:bCs/>
               </w:rPr>
-              <w:t>2024-11-0</w:t>
-            </w:r>
-            <w:r>
-              <w:rPr>
-                <w:b/>
-                <w:bCs/>
-              </w:rPr>
-              <w:t>9</w:t>
+              <w:t>2024-11-09</w:t>
             </w:r>
           </w:p>
         </w:tc>
@@ -23663,14 +23649,7 @@
                 <w:b/>
                 <w:bCs/>
               </w:rPr>
-              <w:t>2024-11-0</w:t>
-            </w:r>
-            <w:r>
-              <w:rPr>
-                <w:b/>
-                <w:bCs/>
-              </w:rPr>
-              <w:t>9</w:t>
+              <w:t>2024-11-09</w:t>
             </w:r>
           </w:p>
         </w:tc>
@@ -28660,14 +28639,7 @@
                 <w:b/>
                 <w:bCs/>
               </w:rPr>
-              <w:t>2024-11-08 08:0</w:t>
-            </w:r>
-            <w:r>
-              <w:rPr>
-                <w:b/>
-                <w:bCs/>
-              </w:rPr>
-              <w:t>0</w:t>
+              <w:t>2024-11-08 08:00</w:t>
             </w:r>
           </w:p>
         </w:tc>
@@ -28839,14 +28811,7 @@
                 <w:b/>
                 <w:bCs/>
               </w:rPr>
-              <w:t>2024-11-08 08:0</w:t>
-            </w:r>
-            <w:r>
-              <w:rPr>
-                <w:b/>
-                <w:bCs/>
-              </w:rPr>
-              <w:t>1</w:t>
+              <w:t>2024-11-08 08:01</w:t>
             </w:r>
           </w:p>
         </w:tc>
@@ -34167,7 +34132,7 @@
             </wp:anchor>
           </w:drawing>
         </mc:Choice>
-        <mc:Fallback xmlns:a="http://schemas.openxmlformats.org/drawingml/2006/main" xmlns:pic="http://schemas.openxmlformats.org/drawingml/2006/picture" xmlns:a14="http://schemas.microsoft.com/office/drawing/2010/main">
+        <mc:Fallback xmlns:a14="http://schemas.microsoft.com/office/drawing/2010/main" xmlns:pic="http://schemas.openxmlformats.org/drawingml/2006/picture" xmlns:a="http://schemas.openxmlformats.org/drawingml/2006/main">
           <w:pict>
             <v:line id="Straight Connector 7" style="position:absolute;z-index:251661312;visibility:visible;mso-wrap-style:square;mso-width-percent:0;mso-height-percent:0;mso-wrap-distance-left:9pt;mso-wrap-distance-top:0;mso-wrap-distance-right:9pt;mso-wrap-distance-bottom:0;mso-position-horizontal:absolute;mso-position-horizontal-relative:text;mso-position-vertical:absolute;mso-position-vertical-relative:text;mso-width-percent:0;mso-height-percent:0;mso-width-relative:margin;mso-height-relative:page" o:spid="_x0000_s1026" strokecolor="#393737 [814]" strokeweight="2pt" from=".45pt,1.05pt" to="469.15pt,1.05pt" w14:anchorId="6A4D861F" o:gfxdata="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">
               <v:stroke joinstyle="miter"/>
@@ -37413,6 +37378,7 @@
   <w:style w:type="character" w:default="1" w:styleId="a3">
     <w:name w:val="Default Paragraph Font"/>
     <w:uiPriority w:val="1"/>
+    <w:semiHidden/>
     <w:unhideWhenUsed/>
   </w:style>
   <w:style w:type="table" w:default="1" w:styleId="a4">
@@ -38438,15 +38404,27 @@
 </file>
 
 <file path=customXml/item1.xml><?xml version="1.0" encoding="utf-8"?>
-<?mso-contentType ?>
-<FormTemplates xmlns="http://schemas.microsoft.com/sharepoint/v3/contenttype/forms">
-  <Display>DocumentLibraryForm</Display>
-  <Edit>DocumentLibraryForm</Edit>
-  <New>DocumentLibraryForm</New>
-</FormTemplates>
+<b:Sources xmlns:b="http://schemas.openxmlformats.org/officeDocument/2006/bibliography" xmlns="http://schemas.openxmlformats.org/officeDocument/2006/bibliography" SelectedStyle="\APASixthEditionOfficeOnline.xsl" StyleName="APA" Version="6"/>
 </file>
 
 <file path=customXml/item2.xml><?xml version="1.0" encoding="utf-8"?>
+<p:properties xmlns:p="http://schemas.microsoft.com/office/2006/metadata/properties" xmlns:xsi="http://www.w3.org/2001/XMLSchema-instance" xmlns:pc="http://schemas.microsoft.com/office/infopath/2007/PartnerControls">
+  <documentManagement>
+    <SharedWithUsers xmlns="a156e92d-423a-4625-9818-f5e87239af8a">
+      <UserInfo>
+        <DisplayName/>
+        <AccountId xsi:nil="true"/>
+        <AccountType/>
+      </UserInfo>
+    </SharedWithUsers>
+    <lcf76f155ced4ddcb4097134ff3c332f xmlns="a60d0634-94da-4e6e-b36f-66eaaf0b6f4e">
+      <Terms xmlns="http://schemas.microsoft.com/office/infopath/2007/PartnerControls"/>
+    </lcf76f155ced4ddcb4097134ff3c332f>
+  </documentManagement>
+</p:properties>
+</file>
+
+<file path=customXml/item3.xml><?xml version="1.0" encoding="utf-8"?>
 <ct:contentTypeSchema xmlns:ct="http://schemas.microsoft.com/office/2006/metadata/contentType" xmlns:ma="http://schemas.microsoft.com/office/2006/metadata/properties/metaAttributes" ct:_="" ma:_="" ma:contentTypeName="Document" ma:contentTypeID="0x010100F71F8A81E89B1E4A872028645FD1B6AE" ma:contentTypeVersion="11" ma:contentTypeDescription="Create a new document." ma:contentTypeScope="" ma:versionID="00e7a2aec32c88b8ca7efc9843325748">
   <xsd:schema xmlns:xsd="http://www.w3.org/2001/XMLSchema" xmlns:xs="http://www.w3.org/2001/XMLSchema" xmlns:p="http://schemas.microsoft.com/office/2006/metadata/properties" xmlns:ns2="a60d0634-94da-4e6e-b36f-66eaaf0b6f4e" xmlns:ns3="a156e92d-423a-4625-9818-f5e87239af8a" targetNamespace="http://schemas.microsoft.com/office/2006/metadata/properties" ma:root="true" ma:fieldsID="f6caa66f0c7935a35dae6e174e32ee4b" ns2:_="" ns3:_="">
     <xsd:import namespace="a60d0634-94da-4e6e-b36f-66eaaf0b6f4e"/>
@@ -38651,36 +38629,35 @@
 </ct:contentTypeSchema>
 </file>
 
-<file path=customXml/item3.xml><?xml version="1.0" encoding="utf-8"?>
-<p:properties xmlns:p="http://schemas.microsoft.com/office/2006/metadata/properties" xmlns:xsi="http://www.w3.org/2001/XMLSchema-instance" xmlns:pc="http://schemas.microsoft.com/office/infopath/2007/PartnerControls">
-  <documentManagement>
-    <SharedWithUsers xmlns="a156e92d-423a-4625-9818-f5e87239af8a">
-      <UserInfo>
-        <DisplayName/>
-        <AccountId xsi:nil="true"/>
-        <AccountType/>
-      </UserInfo>
-    </SharedWithUsers>
-    <lcf76f155ced4ddcb4097134ff3c332f xmlns="a60d0634-94da-4e6e-b36f-66eaaf0b6f4e">
-      <Terms xmlns="http://schemas.microsoft.com/office/infopath/2007/PartnerControls"/>
-    </lcf76f155ced4ddcb4097134ff3c332f>
-  </documentManagement>
-</p:properties>
-</file>
-
 <file path=customXml/item4.xml><?xml version="1.0" encoding="utf-8"?>
-<b:Sources xmlns:b="http://schemas.openxmlformats.org/officeDocument/2006/bibliography" xmlns="http://schemas.openxmlformats.org/officeDocument/2006/bibliography" SelectedStyle="\APASixthEditionOfficeOnline.xsl" StyleName="APA" Version="6"/>
+<?mso-contentType ?>
+<FormTemplates xmlns="http://schemas.microsoft.com/sharepoint/v3/contenttype/forms">
+  <Display>DocumentLibraryForm</Display>
+  <Edit>DocumentLibraryForm</Edit>
+  <New>DocumentLibraryForm</New>
+</FormTemplates>
 </file>
 
 <file path=customXml/itemProps1.xml><?xml version="1.0" encoding="utf-8"?>
-<ds:datastoreItem xmlns:ds="http://schemas.openxmlformats.org/officeDocument/2006/customXml" ds:itemID="{CEAD825D-2413-46BA-BB1F-DCE637B19B0C}">
+<ds:datastoreItem xmlns:ds="http://schemas.openxmlformats.org/officeDocument/2006/customXml" ds:itemID="{4F063263-CDDD-4655-A549-1619AC55524E}">
   <ds:schemaRefs>
-    <ds:schemaRef ds:uri="http://schemas.microsoft.com/sharepoint/v3/contenttype/forms"/>
+    <ds:schemaRef ds:uri="http://schemas.openxmlformats.org/officeDocument/2006/bibliography"/>
   </ds:schemaRefs>
 </ds:datastoreItem>
 </file>
 
 <file path=customXml/itemProps2.xml><?xml version="1.0" encoding="utf-8"?>
+<ds:datastoreItem xmlns:ds="http://schemas.openxmlformats.org/officeDocument/2006/customXml" ds:itemID="{E4B4D352-B35B-4B3A-95D2-902933709BD2}">
+  <ds:schemaRefs>
+    <ds:schemaRef ds:uri="http://schemas.microsoft.com/office/2006/metadata/properties"/>
+    <ds:schemaRef ds:uri="http://schemas.microsoft.com/office/infopath/2007/PartnerControls"/>
+    <ds:schemaRef ds:uri="a156e92d-423a-4625-9818-f5e87239af8a"/>
+    <ds:schemaRef ds:uri="a60d0634-94da-4e6e-b36f-66eaaf0b6f4e"/>
+  </ds:schemaRefs>
+</ds:datastoreItem>
+</file>
+
+<file path=customXml/itemProps3.xml><?xml version="1.0" encoding="utf-8"?>
 <ds:datastoreItem xmlns:ds="http://schemas.openxmlformats.org/officeDocument/2006/customXml" ds:itemID="{5C451799-F9B0-43E0-ABE9-80ABBAA59FE8}">
   <ds:schemaRefs>
     <ds:schemaRef ds:uri="http://schemas.microsoft.com/office/2006/metadata/contentType"/>
@@ -38699,21 +38676,10 @@
 </ds:datastoreItem>
 </file>
 
-<file path=customXml/itemProps3.xml><?xml version="1.0" encoding="utf-8"?>
-<ds:datastoreItem xmlns:ds="http://schemas.openxmlformats.org/officeDocument/2006/customXml" ds:itemID="{E4B4D352-B35B-4B3A-95D2-902933709BD2}">
+<file path=customXml/itemProps4.xml><?xml version="1.0" encoding="utf-8"?>
+<ds:datastoreItem xmlns:ds="http://schemas.openxmlformats.org/officeDocument/2006/customXml" ds:itemID="{CEAD825D-2413-46BA-BB1F-DCE637B19B0C}">
   <ds:schemaRefs>
-    <ds:schemaRef ds:uri="http://schemas.microsoft.com/office/2006/metadata/properties"/>
-    <ds:schemaRef ds:uri="http://schemas.microsoft.com/office/infopath/2007/PartnerControls"/>
-    <ds:schemaRef ds:uri="a156e92d-423a-4625-9818-f5e87239af8a"/>
-    <ds:schemaRef ds:uri="a60d0634-94da-4e6e-b36f-66eaaf0b6f4e"/>
-  </ds:schemaRefs>
-</ds:datastoreItem>
-</file>
-
-<file path=customXml/itemProps4.xml><?xml version="1.0" encoding="utf-8"?>
-<ds:datastoreItem xmlns:ds="http://schemas.openxmlformats.org/officeDocument/2006/customXml" ds:itemID="{4F063263-CDDD-4655-A549-1619AC55524E}">
-  <ds:schemaRefs>
-    <ds:schemaRef ds:uri="http://schemas.openxmlformats.org/officeDocument/2006/bibliography"/>
+    <ds:schemaRef ds:uri="http://schemas.microsoft.com/sharepoint/v3/contenttype/forms"/>
   </ds:schemaRefs>
 </ds:datastoreItem>
 </file>
</xml_diff>